<commit_message>
v1.1.0: agent tool use, period comparison, PDF export, design system
- AI analyst gains typed read-only tools (get_metric, compare_programs,
  get_measures, get_issue_summary, get_trends, get_demographics) driven
  by an agentic tool loop in the Anthropic provider
- Period-over-period comparison: headline/program deltas, deterministic
  narrative, compare CLI command, and a new Streamlit page
- Program-scoped performance measures (program: field on measures)
- PDF report export via Playwright Chromium or Microsoft Edge; offline
  HTML charts (--offline-charts); example PDF included
- Validated colorblind-safe design system applied to charts, Streamlit
  theme, and reports; tokens documented and synced to Claude Design
- MCP server (grant-assistant-mcp), Dockerfile, README screenshots
  captured headlessly, PUBLISHING.md deployment guide
- 173 tests passing; ruff, mypy, and format checks clean

Co-Authored-By: Claude Fable 5 <noreply@anthropic.com>
</commit_message>
<xml_diff>
--- a/examples/grant_report.docx
+++ b/examples/grant_report.docx
@@ -15,7 +15,7 @@
       <w:r>
         <w:rPr>
           <w:b/>
-          <w:color w:val="1E3A8A"/>
+          <w:color w:val="1C5CAB"/>
           <w:sz w:val="60"/>
         </w:rPr>
         <w:t>Housing Stability Grant — Annual Outcome Report</w:t>
@@ -27,7 +27,7 @@
       </w:pPr>
       <w:r>
         <w:rPr>
-          <w:color w:val="64748B"/>
+          <w:color w:val="52514E"/>
           <w:sz w:val="36"/>
         </w:rPr>
         <w:t>Housing Stability Grant</w:t>
@@ -39,7 +39,7 @@
       </w:pPr>
       <w:r>
         <w:rPr>
-          <w:color w:val="64748B"/>
+          <w:color w:val="52514E"/>
           <w:sz w:val="22"/>
         </w:rPr>
         <w:t>Reporting Period: July 01, 2024 – June 30, 2025</w:t>
@@ -51,7 +51,7 @@
       </w:pPr>
       <w:r>
         <w:rPr>
-          <w:color w:val="64748B"/>
+          <w:color w:val="52514E"/>
           <w:sz w:val="22"/>
         </w:rPr>
         <w:t>Prepared by: Program Data &amp; Evaluation Team</w:t>
@@ -63,7 +63,7 @@
       </w:pPr>
       <w:r>
         <w:rPr>
-          <w:color w:val="64748B"/>
+          <w:color w:val="52514E"/>
           <w:sz w:val="22"/>
         </w:rPr>
         <w:t>Generated: August 01, 2026</w:t>
@@ -75,7 +75,7 @@
       </w:pPr>
       <w:r>
         <w:rPr>
-          <w:color w:val="64748B"/>
+          <w:color w:val="52514E"/>
           <w:sz w:val="22"/>
         </w:rPr>
         <w:t>Synthetic demonstration data — contains no real client information.</w:t>
@@ -222,7 +222,7 @@
     <w:p>
       <w:r>
         <w:rPr>
-          <w:color w:val="64748B"/>
+          <w:color w:val="52514E"/>
           <w:sz w:val="18"/>
         </w:rPr>
         <w:t>Narrative mode: Deterministic narrative (non-AI mode).</w:t>

</xml_diff>

<commit_message>
Fix PDF pagination and restrict gender values
PDF: charts and tables were cut off because Plotly sizes its SVGs once at
the browser viewport width, which did not match the paper. Lay the page
out at the printable width (720px = Letter minus 0.5in margins) before
printing, resize charts after load, and add print rules: @page size and
margins, break-inside avoidance for tables/cards/charts/list items,
repeated table headers, headings kept with their content, and a page
break after the cover. Verified: no elements overflow the print width,
16-page PDF renders cleanly.

Data: gender values are now Female, Male, Declined, Unknown in both the
generator and the two profiles. The controlled-value audit demo now uses
an unexpected race label instead.

Adds regression tests for the print rules and for generated data staying
inside the profile vocabularies.

Co-Authored-By: Claude Fable 5 <noreply@anthropic.com>
</commit_message>
<xml_diff>
--- a/examples/grant_report.docx
+++ b/examples/grant_report.docx
@@ -687,7 +687,7 @@
           </w:tcPr>
           <w:p>
             <w:r>
-              <w:t>119</w:t>
+              <w:t>122</w:t>
             </w:r>
           </w:p>
         </w:tc>
@@ -709,51 +709,7 @@
           </w:tcPr>
           <w:p>
             <w:r>
-              <w:t>117</w:t>
-            </w:r>
-          </w:p>
-        </w:tc>
-      </w:tr>
-      <w:tr>
-        <w:tc>
-          <w:tcPr>
-            <w:tcW w:type="dxa" w:w="4320"/>
-          </w:tcPr>
-          <w:p>
-            <w:r>
-              <w:t>Non-Binary</w:t>
-            </w:r>
-          </w:p>
-        </w:tc>
-        <w:tc>
-          <w:tcPr>
-            <w:tcW w:type="dxa" w:w="4320"/>
-          </w:tcPr>
-          <w:p>
-            <w:r>
-              <w:t>8</w:t>
-            </w:r>
-          </w:p>
-        </w:tc>
-      </w:tr>
-      <w:tr>
-        <w:tc>
-          <w:tcPr>
-            <w:tcW w:type="dxa" w:w="4320"/>
-          </w:tcPr>
-          <w:p>
-            <w:r>
-              <w:t>Transgender</w:t>
-            </w:r>
-          </w:p>
-        </w:tc>
-        <w:tc>
-          <w:tcPr>
-            <w:tcW w:type="dxa" w:w="4320"/>
-          </w:tcPr>
-          <w:p>
-            <w:r>
-              <w:t>8</w:t>
+              <w:t>121</w:t>
             </w:r>
           </w:p>
         </w:tc>
@@ -775,7 +731,7 @@
           </w:tcPr>
           <w:p>
             <w:r>
-              <w:t>7</w:t>
+              <w:t>10</w:t>
             </w:r>
           </w:p>
         </w:tc>
@@ -787,7 +743,7 @@
           </w:tcPr>
           <w:p>
             <w:r>
-              <w:t>F</w:t>
+              <w:t>Unknown</w:t>
             </w:r>
           </w:p>
         </w:tc>
@@ -797,7 +753,7 @@
           </w:tcPr>
           <w:p>
             <w:r>
-              <w:t>1</w:t>
+              <w:t>7</w:t>
             </w:r>
           </w:p>
         </w:tc>
@@ -911,7 +867,7 @@
           </w:tcPr>
           <w:p>
             <w:r>
-              <w:t>19</w:t>
+              <w:t>18</w:t>
             </w:r>
           </w:p>
         </w:tc>
@@ -1022,6 +978,28 @@
           <w:p>
             <w:r>
               <w:t>5</w:t>
+            </w:r>
+          </w:p>
+        </w:tc>
+      </w:tr>
+      <w:tr>
+        <w:tc>
+          <w:tcPr>
+            <w:tcW w:type="dxa" w:w="4320"/>
+          </w:tcPr>
+          <w:p>
+            <w:r>
+              <w:t>Caucasian</w:t>
+            </w:r>
+          </w:p>
+        </w:tc>
+        <w:tc>
+          <w:tcPr>
+            <w:tcW w:type="dxa" w:w="4320"/>
+          </w:tcPr>
+          <w:p>
+            <w:r>
+              <w:t>1</w:t>
             </w:r>
           </w:p>
         </w:tc>

</xml_diff>

<commit_message>
v1.6.1: route chat responses automatically, rename example grants
The chat asked the user to pick streaming vs tool lookup, but they had no way
to know which a question needed. should_stream now routes by intent — narrative
questions stream, everything else (including unrecognized) takes the traced
tool loop — and the toggle became Automatic / Always stream / Always tools.

Example grants renamed to Stable Homes and Bridge to Home (display name only;
profile_id unchanged), the selector now shows the grant name, and all
committed artifacts regenerated to match.

Co-Authored-By: Claude <noreply@anthropic.com>
</commit_message>
<xml_diff>
--- a/examples/grant_report.docx
+++ b/examples/grant_report.docx
@@ -18,7 +18,7 @@
           <w:color w:val="1C5CAB"/>
           <w:sz w:val="60"/>
         </w:rPr>
-        <w:t>Housing Stability Grant — Annual Outcome Report</w:t>
+        <w:t>Stable Homes Grant — Annual Outcome Report</w:t>
       </w:r>
     </w:p>
     <w:p>
@@ -30,7 +30,7 @@
           <w:color w:val="52514E"/>
           <w:sz w:val="36"/>
         </w:rPr>
-        <w:t>Housing Stability Grant</w:t>
+        <w:t>Stable Homes Grant</w:t>
       </w:r>
     </w:p>
     <w:p>
@@ -66,7 +66,7 @@
           <w:color w:val="52514E"/>
           <w:sz w:val="22"/>
         </w:rPr>
-        <w:t>Generated: August 01, 2026</w:t>
+        <w:t>Generated: August 10, 2026</w:t>
       </w:r>
     </w:p>
     <w:p>
@@ -214,18 +214,14 @@
         <w:t>Executive Summary</w:t>
       </w:r>
     </w:p>
-    <w:p>
-      <w:r>
-        <w:t>During the reporting period (July 2024–June 2025), Housing Stability Grant programs enrolled 260 clients across 260 households (472 individuals). Of 145 exits, 93 (64.1%) were successful and 93 (64.1%) went to permanent housing. Median household income change at exit was $0, with 46.8% of households increasing income. 5 of 5 performance measures met their targets. Headline: 64.1% of the 145 exits this period were successful, against 5 tracked measures (5 met, 0 missed).</w:t>
-      </w:r>
-    </w:p>
+    <w:p/>
     <w:p>
       <w:r>
         <w:rPr>
           <w:color w:val="52514E"/>
           <w:sz w:val="18"/>
         </w:rPr>
-        <w:t>Narrative mode: Deterministic narrative (non-AI mode).</w:t>
+        <w:t>Narrative mode: AI-assisted narrative grounded in deterministic calculations.</w:t>
       </w:r>
     </w:p>
     <w:p>
@@ -238,7 +234,7 @@
     </w:p>
     <w:p>
       <w:r>
-        <w:t>Audited 263 records for Housing Stability Grant: overall data quality score 85.1/100 (grade B). Findings by severity: 9 critical, 31 high, 27 medium, 10 low, 38 informational. 5 blocking issue type(s) must be resolved before submission: Missing required fields, Missing exit destination, Duplicate client enrollment, Unknown program. Largest issues: Duplicate client enrollment (6 records); Exit before enrollment (3 records); Missing required fields (4 records).</w:t>
+        <w:t>Audited 263 records for Stable Homes Grant: overall data quality score 85.1/100 (grade B). Findings by severity: 9 critical, 31 high, 27 medium, 10 low, 38 informational. 5 blocking issue type(s) must be resolved before submission: Missing required fields, Missing exit destination, Exit before enrollment, Duplicate client enrollment. Largest issues: Duplicate client enrollment (6 records); Exit before enrollment (3 records); Missing required fields (4 records).</w:t>
       </w:r>
     </w:p>
     <w:tbl>
@@ -417,6 +413,14 @@
         <w:pStyle w:val="ListBullet"/>
       </w:pPr>
       <w:r>
+        <w:t>Exit before enrollment — 3 record(s)</w:t>
+      </w:r>
+    </w:p>
+    <w:p>
+      <w:pPr>
+        <w:pStyle w:val="ListBullet"/>
+      </w:pPr>
+      <w:r>
         <w:t>Duplicate client enrollment — 6 record(s)</w:t>
       </w:r>
     </w:p>
@@ -426,14 +430,6 @@
       </w:pPr>
       <w:r>
         <w:t>Unknown program — 2 record(s)</w:t>
-      </w:r>
-    </w:p>
-    <w:p>
-      <w:pPr>
-        <w:pStyle w:val="ListBullet"/>
-      </w:pPr>
-      <w:r>
-        <w:t>Exit before enrollment — 3 record(s)</w:t>
       </w:r>
     </w:p>
     <w:p>
@@ -1956,6 +1952,58 @@
     <w:p/>
     <w:p>
       <w:pPr>
+        <w:jc w:val="center"/>
+      </w:pPr>
+      <w:r>
+        <w:drawing>
+          <wp:inline xmlns:a="http://schemas.openxmlformats.org/drawingml/2006/main" xmlns:pic="http://schemas.openxmlformats.org/drawingml/2006/picture">
+            <wp:extent cx="5486400" cy="3200400"/>
+            <wp:docPr id="1" name="Picture 1"/>
+            <wp:cNvGraphicFramePr>
+              <a:graphicFrameLocks noChangeAspect="1"/>
+            </wp:cNvGraphicFramePr>
+            <a:graphic>
+              <a:graphicData uri="http://schemas.openxmlformats.org/drawingml/2006/picture">
+                <pic:pic>
+                  <pic:nvPicPr>
+                    <pic:cNvPr id="0" name="image.png"/>
+                    <pic:cNvPicPr/>
+                  </pic:nvPicPr>
+                  <pic:blipFill>
+                    <a:blip r:embed="rId9"/>
+                    <a:stretch>
+                      <a:fillRect/>
+                    </a:stretch>
+                  </pic:blipFill>
+                  <pic:spPr>
+                    <a:xfrm>
+                      <a:off x="0" y="0"/>
+                      <a:ext cx="5486400" cy="3200400"/>
+                    </a:xfrm>
+                    <a:prstGeom prst="rect"/>
+                  </pic:spPr>
+                </pic:pic>
+              </a:graphicData>
+            </a:graphic>
+          </wp:inline>
+        </w:drawing>
+      </w:r>
+    </w:p>
+    <w:p>
+      <w:pPr>
+        <w:jc w:val="center"/>
+      </w:pPr>
+      <w:r>
+        <w:rPr>
+          <w:i/>
+          <w:color w:val="52514E"/>
+          <w:sz w:val="18"/>
+        </w:rPr>
+        <w:t>Monthly enrollments and exits</w:t>
+      </w:r>
+    </w:p>
+    <w:p>
+      <w:pPr>
         <w:pStyle w:val="Heading1"/>
       </w:pPr>
       <w:r>
@@ -2356,6 +2404,58 @@
     <w:p/>
     <w:p>
       <w:pPr>
+        <w:jc w:val="center"/>
+      </w:pPr>
+      <w:r>
+        <w:drawing>
+          <wp:inline xmlns:a="http://schemas.openxmlformats.org/drawingml/2006/main" xmlns:pic="http://schemas.openxmlformats.org/drawingml/2006/picture">
+            <wp:extent cx="5486400" cy="3200400"/>
+            <wp:docPr id="2" name="Picture 2"/>
+            <wp:cNvGraphicFramePr>
+              <a:graphicFrameLocks noChangeAspect="1"/>
+            </wp:cNvGraphicFramePr>
+            <a:graphic>
+              <a:graphicData uri="http://schemas.openxmlformats.org/drawingml/2006/picture">
+                <pic:pic>
+                  <pic:nvPicPr>
+                    <pic:cNvPr id="0" name="image.png"/>
+                    <pic:cNvPicPr/>
+                  </pic:nvPicPr>
+                  <pic:blipFill>
+                    <a:blip r:embed="rId10"/>
+                    <a:stretch>
+                      <a:fillRect/>
+                    </a:stretch>
+                  </pic:blipFill>
+                  <pic:spPr>
+                    <a:xfrm>
+                      <a:off x="0" y="0"/>
+                      <a:ext cx="5486400" cy="3200400"/>
+                    </a:xfrm>
+                    <a:prstGeom prst="rect"/>
+                  </pic:spPr>
+                </pic:pic>
+              </a:graphicData>
+            </a:graphic>
+          </wp:inline>
+        </w:drawing>
+      </w:r>
+    </w:p>
+    <w:p>
+      <w:pPr>
+        <w:jc w:val="center"/>
+      </w:pPr>
+      <w:r>
+        <w:rPr>
+          <w:i/>
+          <w:color w:val="52514E"/>
+          <w:sz w:val="18"/>
+        </w:rPr>
+        <w:t>Where households went at exit</w:t>
+      </w:r>
+    </w:p>
+    <w:p>
+      <w:pPr>
         <w:pStyle w:val="Heading1"/>
       </w:pPr>
       <w:r>
@@ -2534,6 +2634,58 @@
       </w:tr>
     </w:tbl>
     <w:p/>
+    <w:p>
+      <w:pPr>
+        <w:jc w:val="center"/>
+      </w:pPr>
+      <w:r>
+        <w:drawing>
+          <wp:inline xmlns:a="http://schemas.openxmlformats.org/drawingml/2006/main" xmlns:pic="http://schemas.openxmlformats.org/drawingml/2006/picture">
+            <wp:extent cx="5486400" cy="3200400"/>
+            <wp:docPr id="3" name="Picture 3"/>
+            <wp:cNvGraphicFramePr>
+              <a:graphicFrameLocks noChangeAspect="1"/>
+            </wp:cNvGraphicFramePr>
+            <a:graphic>
+              <a:graphicData uri="http://schemas.openxmlformats.org/drawingml/2006/picture">
+                <pic:pic>
+                  <pic:nvPicPr>
+                    <pic:cNvPr id="0" name="image.png"/>
+                    <pic:cNvPicPr/>
+                  </pic:nvPicPr>
+                  <pic:blipFill>
+                    <a:blip r:embed="rId11"/>
+                    <a:stretch>
+                      <a:fillRect/>
+                    </a:stretch>
+                  </pic:blipFill>
+                  <pic:spPr>
+                    <a:xfrm>
+                      <a:off x="0" y="0"/>
+                      <a:ext cx="5486400" cy="3200400"/>
+                    </a:xfrm>
+                    <a:prstGeom prst="rect"/>
+                  </pic:spPr>
+                </pic:pic>
+              </a:graphicData>
+            </a:graphic>
+          </wp:inline>
+        </w:drawing>
+      </w:r>
+    </w:p>
+    <w:p>
+      <w:pPr>
+        <w:jc w:val="center"/>
+      </w:pPr>
+      <w:r>
+        <w:rPr>
+          <w:i/>
+          <w:color w:val="52514E"/>
+          <w:sz w:val="18"/>
+        </w:rPr>
+        <w:t>Income change from entry to exit</w:t>
+      </w:r>
+    </w:p>
     <w:p>
       <w:pPr>
         <w:pStyle w:val="Heading1"/>
@@ -2780,6 +2932,58 @@
       </w:tr>
     </w:tbl>
     <w:p/>
+    <w:p>
+      <w:pPr>
+        <w:jc w:val="center"/>
+      </w:pPr>
+      <w:r>
+        <w:drawing>
+          <wp:inline xmlns:a="http://schemas.openxmlformats.org/drawingml/2006/main" xmlns:pic="http://schemas.openxmlformats.org/drawingml/2006/picture">
+            <wp:extent cx="5486400" cy="3200400"/>
+            <wp:docPr id="4" name="Picture 4"/>
+            <wp:cNvGraphicFramePr>
+              <a:graphicFrameLocks noChangeAspect="1"/>
+            </wp:cNvGraphicFramePr>
+            <a:graphic>
+              <a:graphicData uri="http://schemas.openxmlformats.org/drawingml/2006/picture">
+                <pic:pic>
+                  <pic:nvPicPr>
+                    <pic:cNvPr id="0" name="image.png"/>
+                    <pic:cNvPicPr/>
+                  </pic:nvPicPr>
+                  <pic:blipFill>
+                    <a:blip r:embed="rId12"/>
+                    <a:stretch>
+                      <a:fillRect/>
+                    </a:stretch>
+                  </pic:blipFill>
+                  <pic:spPr>
+                    <a:xfrm>
+                      <a:off x="0" y="0"/>
+                      <a:ext cx="5486400" cy="3200400"/>
+                    </a:xfrm>
+                    <a:prstGeom prst="rect"/>
+                  </pic:spPr>
+                </pic:pic>
+              </a:graphicData>
+            </a:graphic>
+          </wp:inline>
+        </w:drawing>
+      </w:r>
+    </w:p>
+    <w:p>
+      <w:pPr>
+        <w:jc w:val="center"/>
+      </w:pPr>
+      <w:r>
+        <w:rPr>
+          <w:i/>
+          <w:color w:val="52514E"/>
+          <w:sz w:val="18"/>
+        </w:rPr>
+        <w:t>Follow-up completion by interval</w:t>
+      </w:r>
+    </w:p>
     <w:p>
       <w:pPr>
         <w:pStyle w:val="Heading1"/>
@@ -3066,6 +3270,58 @@
       </w:tr>
     </w:tbl>
     <w:p/>
+    <w:p>
+      <w:pPr>
+        <w:jc w:val="center"/>
+      </w:pPr>
+      <w:r>
+        <w:drawing>
+          <wp:inline xmlns:a="http://schemas.openxmlformats.org/drawingml/2006/main" xmlns:pic="http://schemas.openxmlformats.org/drawingml/2006/picture">
+            <wp:extent cx="5486400" cy="3200400"/>
+            <wp:docPr id="5" name="Picture 5"/>
+            <wp:cNvGraphicFramePr>
+              <a:graphicFrameLocks noChangeAspect="1"/>
+            </wp:cNvGraphicFramePr>
+            <a:graphic>
+              <a:graphicData uri="http://schemas.openxmlformats.org/drawingml/2006/picture">
+                <pic:pic>
+                  <pic:nvPicPr>
+                    <pic:cNvPr id="0" name="image.png"/>
+                    <pic:cNvPicPr/>
+                  </pic:nvPicPr>
+                  <pic:blipFill>
+                    <a:blip r:embed="rId13"/>
+                    <a:stretch>
+                      <a:fillRect/>
+                    </a:stretch>
+                  </pic:blipFill>
+                  <pic:spPr>
+                    <a:xfrm>
+                      <a:off x="0" y="0"/>
+                      <a:ext cx="5486400" cy="3200400"/>
+                    </a:xfrm>
+                    <a:prstGeom prst="rect"/>
+                  </pic:spPr>
+                </pic:pic>
+              </a:graphicData>
+            </a:graphic>
+          </wp:inline>
+        </w:drawing>
+      </w:r>
+    </w:p>
+    <w:p>
+      <w:pPr>
+        <w:jc w:val="center"/>
+      </w:pPr>
+      <w:r>
+        <w:rPr>
+          <w:i/>
+          <w:color w:val="52514E"/>
+          <w:sz w:val="18"/>
+        </w:rPr>
+        <w:t>Performance measures against target</w:t>
+      </w:r>
+    </w:p>
     <w:p>
       <w:pPr>
         <w:pStyle w:val="Heading1"/>
@@ -3358,6 +3614,110 @@
     <w:p/>
     <w:p>
       <w:pPr>
+        <w:jc w:val="center"/>
+      </w:pPr>
+      <w:r>
+        <w:drawing>
+          <wp:inline xmlns:a="http://schemas.openxmlformats.org/drawingml/2006/main" xmlns:pic="http://schemas.openxmlformats.org/drawingml/2006/picture">
+            <wp:extent cx="5486400" cy="3200400"/>
+            <wp:docPr id="6" name="Picture 6"/>
+            <wp:cNvGraphicFramePr>
+              <a:graphicFrameLocks noChangeAspect="1"/>
+            </wp:cNvGraphicFramePr>
+            <a:graphic>
+              <a:graphicData uri="http://schemas.openxmlformats.org/drawingml/2006/picture">
+                <pic:pic>
+                  <pic:nvPicPr>
+                    <pic:cNvPr id="0" name="image.png"/>
+                    <pic:cNvPicPr/>
+                  </pic:nvPicPr>
+                  <pic:blipFill>
+                    <a:blip r:embed="rId14"/>
+                    <a:stretch>
+                      <a:fillRect/>
+                    </a:stretch>
+                  </pic:blipFill>
+                  <pic:spPr>
+                    <a:xfrm>
+                      <a:off x="0" y="0"/>
+                      <a:ext cx="5486400" cy="3200400"/>
+                    </a:xfrm>
+                    <a:prstGeom prst="rect"/>
+                  </pic:spPr>
+                </pic:pic>
+              </a:graphicData>
+            </a:graphic>
+          </wp:inline>
+        </w:drawing>
+      </w:r>
+    </w:p>
+    <w:p>
+      <w:pPr>
+        <w:jc w:val="center"/>
+      </w:pPr>
+      <w:r>
+        <w:rPr>
+          <w:i/>
+          <w:color w:val="52514E"/>
+          <w:sz w:val="18"/>
+        </w:rPr>
+        <w:t>Enrollments and exits by program</w:t>
+      </w:r>
+    </w:p>
+    <w:p>
+      <w:pPr>
+        <w:jc w:val="center"/>
+      </w:pPr>
+      <w:r>
+        <w:drawing>
+          <wp:inline xmlns:a="http://schemas.openxmlformats.org/drawingml/2006/main" xmlns:pic="http://schemas.openxmlformats.org/drawingml/2006/picture">
+            <wp:extent cx="5486400" cy="3200400"/>
+            <wp:docPr id="7" name="Picture 7"/>
+            <wp:cNvGraphicFramePr>
+              <a:graphicFrameLocks noChangeAspect="1"/>
+            </wp:cNvGraphicFramePr>
+            <a:graphic>
+              <a:graphicData uri="http://schemas.openxmlformats.org/drawingml/2006/picture">
+                <pic:pic>
+                  <pic:nvPicPr>
+                    <pic:cNvPr id="0" name="image.png"/>
+                    <pic:cNvPicPr/>
+                  </pic:nvPicPr>
+                  <pic:blipFill>
+                    <a:blip r:embed="rId15"/>
+                    <a:stretch>
+                      <a:fillRect/>
+                    </a:stretch>
+                  </pic:blipFill>
+                  <pic:spPr>
+                    <a:xfrm>
+                      <a:off x="0" y="0"/>
+                      <a:ext cx="5486400" cy="3200400"/>
+                    </a:xfrm>
+                    <a:prstGeom prst="rect"/>
+                  </pic:spPr>
+                </pic:pic>
+              </a:graphicData>
+            </a:graphic>
+          </wp:inline>
+        </w:drawing>
+      </w:r>
+    </w:p>
+    <w:p>
+      <w:pPr>
+        <w:jc w:val="center"/>
+      </w:pPr>
+      <w:r>
+        <w:rPr>
+          <w:i/>
+          <w:color w:val="52514E"/>
+          <w:sz w:val="18"/>
+        </w:rPr>
+        <w:t>Outcome rates by program</w:t>
+      </w:r>
+    </w:p>
+    <w:p>
+      <w:pPr>
         <w:pStyle w:val="Heading1"/>
       </w:pPr>
       <w:r>
@@ -3457,6 +3817,14 @@
         <w:pStyle w:val="ListBullet"/>
       </w:pPr>
       <w:r>
+        <w:t>Blocking: Exit before enrollment affects 3 record(s) — Exit dates fall before the enrollment date, which is impossible and produces negative lengths of stay.</w:t>
+      </w:r>
+    </w:p>
+    <w:p>
+      <w:pPr>
+        <w:pStyle w:val="ListBullet"/>
+      </w:pPr>
+      <w:r>
         <w:t>Blocking: Duplicate client enrollment affects 6 record(s) — The same client ID appears more than once for the same program and enrollment date. Duplicates inflate enrollment counts and distort every rate.</w:t>
       </w:r>
     </w:p>
@@ -3466,14 +3834,6 @@
       </w:pPr>
       <w:r>
         <w:t>Blocking: Unknown program affects 2 record(s) — Program labels do not match any program or alias defined in the grant profile. These records cannot be attributed to a funded program.</w:t>
-      </w:r>
-    </w:p>
-    <w:p>
-      <w:pPr>
-        <w:pStyle w:val="ListBullet"/>
-      </w:pPr>
-      <w:r>
-        <w:t>Blocking: Exit before enrollment affects 3 record(s) — Exit dates fall before the enrollment date, which is impossible and produces negative lengths of stay.</w:t>
       </w:r>
     </w:p>
     <w:p>

</xml_diff>

<commit_message>
Regenerate committed examples; executive summary was empty
The committed report artifacts predated the executive-summary population
in build_report_data, so every showcase report (HTML/DOCX/PDF/PPTX)
showed a blank <p></p> where the summary belongs -- making the product
look broken to anyone opening a sample. Regenerated from the current
deterministic pipeline (--no-ai) so the summary is grounded and the
artifacts reproduce without an API key; the non-summary sections are
unchanged since AI only touches the executive summary.

Co-Authored-By: Claude <noreply@anthropic.com>
</commit_message>
<xml_diff>
--- a/examples/grant_report.docx
+++ b/examples/grant_report.docx
@@ -214,14 +214,18 @@
         <w:t>Executive Summary</w:t>
       </w:r>
     </w:p>
-    <w:p/>
+    <w:p>
+      <w:r>
+        <w:t>During the reporting period (July 2024–June 2025), Stable Homes Grant programs enrolled 260 clients across 260 households (472 individuals). Of 145 exits, 93 (64.1%) were successful and 93 (64.1%) went to permanent housing. Median household income change at exit was $0, with 46.8% of households increasing income. 5 of 5 performance measures met their targets. Headline: 64.1% of the 145 exits this period were successful, against 5 tracked measures (5 met, 0 missed).</w:t>
+      </w:r>
+    </w:p>
     <w:p>
       <w:r>
         <w:rPr>
           <w:color w:val="52514E"/>
           <w:sz w:val="18"/>
         </w:rPr>
-        <w:t>Narrative mode: AI-assisted narrative grounded in deterministic calculations.</w:t>
+        <w:t>Narrative mode: Deterministic narrative (non-AI mode).</w:t>
       </w:r>
     </w:p>
     <w:p>

</xml_diff>